<commit_message>
728x90 V10: masthead (3D rainbow + silver), logos left, wide 3D letterings, 15 s eruption BANG; Banner10.tsx; mock site 728 slot -> MP4; vault notes (REV/FB/DEC/RUN/SES)
Co-Authored-By: Claude Fable 5.1 <noreply@anthropic.com>

Claude-Session: https://claude.ai/code/session_01MmCXpqEDkDLEtzqtM4Wbt6
</commit_message>
<xml_diff>
--- a/writeup/GBA2026_Winner_Profile_v8_DRAFT.docx
+++ b/writeup/GBA2026_Winner_Profile_v8_DRAFT.docx
@@ -1173,9 +1173,9 @@
         <w:rPr>
           <w:b/>
           <w:bCs/>
-          <w:color w:val="5E5470"/>
-          <w:sz w:val="19"/>
-          <w:szCs w:val="19"/>
+          <w:color w:val="9A7425"/>
+          <w:sz w:val="20"/>
+          <w:szCs w:val="20"/>
         </w:rPr>
         <w:t xml:space="preserve">— DR SHEKINAIH SIEW SIN YAP, Founder and Managing Director</w:t>
       </w:r>
@@ -1543,9 +1543,9 @@
         <w:rPr>
           <w:b/>
           <w:bCs/>
-          <w:color w:val="5E5470"/>
-          <w:sz w:val="19"/>
-          <w:szCs w:val="19"/>
+          <w:color w:val="9A7425"/>
+          <w:sz w:val="20"/>
+          <w:szCs w:val="20"/>
         </w:rPr>
         <w:t xml:space="preserve">— DR SHEKINAIH SIEW SIN YAP</w:t>
       </w:r>
@@ -1885,9 +1885,9 @@
         <w:rPr>
           <w:b/>
           <w:bCs/>
-          <w:color w:val="5E5470"/>
-          <w:sz w:val="19"/>
-          <w:szCs w:val="19"/>
+          <w:color w:val="9A7425"/>
+          <w:sz w:val="20"/>
+          <w:szCs w:val="20"/>
         </w:rPr>
         <w:t xml:space="preserve">— DR SHEKINAIH SIEW SIN YAP, Founder and Managing Director, CE Global Network International Pte. Ltd.</w:t>
       </w:r>

</xml_diff>